<commit_message>
feature: I added the ilustrations for the report document
I added the informe.docx with the illustrations
</commit_message>
<xml_diff>
--- a/informe.docx
+++ b/informe.docx
@@ -7,26 +7,18 @@
         <w:spacing w:before="5000" w:line="480" w:lineRule="auto"/>
         <w:ind w:firstLine="0"/>
         <w:jc w:val="left"/>
-        <w:rPr/>
-      </w:pPr>
-      <w:r>
         <w:rPr>
           <w:b w:val="1"/>
           <w:bCs w:val="1"/>
-          <w:rtl w:val="0"/>
-        </w:rPr>
-        <w:t xml:space="preserve">                                                      </w:t>
-      </w:r>
-      <w:r>
-        <w:rPr>
-          <w:rFonts w:ascii="Times New Roman" w:cs="Times New Roman" w:eastAsia="Times New Roman" w:hAnsi="Times New Roman"/>
+        </w:rPr>
+      </w:pPr>
+      <w:r>
+        <w:rPr>
           <w:b w:val="1"/>
           <w:bCs w:val="1"/>
-          <w:sz w:val="24"/>
-          <w:szCs w:val="24"/>
-          <w:rtl w:val="0"/>
-        </w:rPr>
-        <w:t xml:space="preserve">INFORME DE REQUISITOS</w:t>
+          <w:rtl w:val="0"/>
+        </w:rPr>
+        <w:t xml:space="preserve">             </w:t>
       </w:r>
       <w:r>
         <w:rPr>
@@ -39,20 +31,12 @@
         <w:spacing w:line="480" w:lineRule="auto"/>
         <w:ind w:firstLine="0"/>
         <w:jc w:val="center"/>
-        <w:rPr>
-          <w:rFonts w:ascii="Times New Roman" w:cs="Times New Roman" w:eastAsia="Times New Roman" w:hAnsi="Times New Roman"/>
-          <w:sz w:val="24"/>
-          <w:szCs w:val="24"/>
-        </w:rPr>
-      </w:pPr>
-      <w:r>
-        <w:rPr>
-          <w:rFonts w:ascii="Times New Roman" w:cs="Times New Roman" w:eastAsia="Times New Roman" w:hAnsi="Times New Roman"/>
-          <w:sz w:val="24"/>
-          <w:szCs w:val="24"/>
-          <w:rtl w:val="0"/>
-        </w:rPr>
-        <w:t xml:space="preserve">Planificador de Menús y Lista de Mercado</w:t>
+        <w:rPr/>
+      </w:pPr>
+      <w:r>
+        <w:rPr>
+          <w:rtl w:val="0"/>
+        </w:rPr>
       </w:r>
     </w:p>
     <w:p>
@@ -70,6 +54,19 @@
     </w:p>
     <w:p>
       <w:pPr>
+        <w:ind w:firstLine="0"/>
+        <w:jc w:val="center"/>
+        <w:rPr/>
+      </w:pPr>
+      <w:r>
+        <w:rPr>
+          <w:rtl w:val="0"/>
+        </w:rPr>
+        <w:t xml:space="preserve">Célula 5</w:t>
+      </w:r>
+    </w:p>
+    <w:p>
+      <w:pPr>
         <w:spacing w:line="480" w:lineRule="auto"/>
         <w:ind w:firstLine="0"/>
         <w:jc w:val="center"/>
@@ -79,19 +76,7 @@
         <w:rPr>
           <w:rtl w:val="0"/>
         </w:rPr>
-      </w:r>
-    </w:p>
-    <w:p>
-      <w:pPr>
-        <w:ind w:firstLine="0"/>
-        <w:jc w:val="center"/>
-        <w:rPr/>
-      </w:pPr>
-      <w:r>
-        <w:rPr>
-          <w:rtl w:val="0"/>
-        </w:rPr>
-        <w:t xml:space="preserve">Célula 5</w:t>
+        <w:t xml:space="preserve">CESDE</w:t>
       </w:r>
     </w:p>
     <w:p>
@@ -105,7 +90,7 @@
         <w:rPr>
           <w:rtl w:val="0"/>
         </w:rPr>
-        <w:t xml:space="preserve">CESDE</w:t>
+        <w:t xml:space="preserve">Técnico Laboral en Desarrollo de Software</w:t>
       </w:r>
     </w:p>
     <w:p>
@@ -119,7 +104,7 @@
         <w:rPr>
           <w:rtl w:val="0"/>
         </w:rPr>
-        <w:t xml:space="preserve">Técnico Laboral en Desarrollo de Software</w:t>
+        <w:t xml:space="preserve">Jaime Zapata</w:t>
       </w:r>
     </w:p>
     <w:p>
@@ -133,7 +118,6 @@
         <w:rPr>
           <w:rtl w:val="0"/>
         </w:rPr>
-        <w:t xml:space="preserve">Jaime Zapata</w:t>
       </w:r>
     </w:p>
     <w:p>
@@ -145,6 +129,15 @@
       </w:pPr>
       <w:r>
         <w:rPr>
+          <w:rFonts w:ascii="Times New Roman" w:cs="Times New Roman" w:eastAsia="Times New Roman" w:hAnsi="Times New Roman"/>
+          <w:sz w:val="24"/>
+          <w:szCs w:val="24"/>
+          <w:rtl w:val="0"/>
+        </w:rPr>
+        <w:t xml:space="preserve">Medellín, Colombia</w:t>
+      </w:r>
+      <w:r>
+        <w:rPr>
           <w:rtl w:val="0"/>
         </w:rPr>
       </w:r>
@@ -163,28 +156,6 @@
           <w:szCs w:val="24"/>
           <w:rtl w:val="0"/>
         </w:rPr>
-        <w:t xml:space="preserve">Medellín, Colombia</w:t>
-      </w:r>
-      <w:r>
-        <w:rPr>
-          <w:rtl w:val="0"/>
-        </w:rPr>
-      </w:r>
-    </w:p>
-    <w:p>
-      <w:pPr>
-        <w:spacing w:line="480" w:lineRule="auto"/>
-        <w:ind w:firstLine="0"/>
-        <w:jc w:val="center"/>
-        <w:rPr/>
-      </w:pPr>
-      <w:r>
-        <w:rPr>
-          <w:rFonts w:ascii="Times New Roman" w:cs="Times New Roman" w:eastAsia="Times New Roman" w:hAnsi="Times New Roman"/>
-          <w:sz w:val="24"/>
-          <w:szCs w:val="24"/>
-          <w:rtl w:val="0"/>
-        </w:rPr>
         <w:t xml:space="preserve">2026</w:t>
       </w:r>
       <w:r>
@@ -222,7 +193,7 @@
     </w:p>
     <w:sdt>
       <w:sdtPr>
-        <w:id w:val="759455304"/>
+        <w:id w:val="1341529619"/>
         <w:docPartObj>
           <w:docPartGallery w:val="Table of Contents"/>
           <w:docPartUnique w:val="1"/>
@@ -2439,7 +2410,7 @@
     </w:p>
     <w:sdt>
       <w:sdtPr>
-        <w:id w:val="1867719209"/>
+        <w:id w:val="1311301257"/>
         <w:docPartObj>
           <w:docPartGallery w:val="Table of Contents"/>
           <w:docPartUnique w:val="1"/>
@@ -4827,9 +4798,39 @@
         <w:rPr>
           <w:i w:val="1"/>
           <w:iCs w:val="1"/>
-          <w:rtl w:val="0"/>
-        </w:rPr>
-        <w:t xml:space="preserve">[Diagrama UML de casos de uso: insertar aquí la figura generada en la herramienta de modelado utilizada por el equipo.]</w:t>
+        </w:rPr>
+        <w:drawing>
+          <wp:inline distB="114300" distT="114300" distL="114300" distR="114300">
+            <wp:extent cx="5943600" cy="3962400"/>
+            <wp:effectExtent b="0" l="0" r="0" t="0"/>
+            <wp:docPr id="2" name="image2.png"/>
+            <a:graphic>
+              <a:graphicData uri="http://schemas.openxmlformats.org/drawingml/2006/picture">
+                <pic:pic>
+                  <pic:nvPicPr>
+                    <pic:cNvPr id="0" name="image2.png"/>
+                    <pic:cNvPicPr preferRelativeResize="0"/>
+                  </pic:nvPicPr>
+                  <pic:blipFill>
+                    <a:blip r:embed="rId6"/>
+                    <a:srcRect b="0" l="0" r="0" t="0"/>
+                    <a:stretch>
+                      <a:fillRect/>
+                    </a:stretch>
+                  </pic:blipFill>
+                  <pic:spPr>
+                    <a:xfrm>
+                      <a:off x="0" y="0"/>
+                      <a:ext cx="5943600" cy="3962400"/>
+                    </a:xfrm>
+                    <a:prstGeom prst="rect"/>
+                    <a:ln/>
+                  </pic:spPr>
+                </pic:pic>
+              </a:graphicData>
+            </a:graphic>
+          </wp:inline>
+        </w:drawing>
       </w:r>
       <w:r>
         <w:rPr>
@@ -4855,18 +4856,42 @@
       <w:pPr>
         <w:spacing w:after="0" w:line="480" w:lineRule="auto"/>
         <w:ind w:firstLine="720"/>
-        <w:rPr/>
-      </w:pPr>
-      <w:r>
         <w:rPr>
           <w:rFonts w:ascii="Times New Roman" w:cs="Times New Roman" w:eastAsia="Times New Roman" w:hAnsi="Times New Roman"/>
           <w:color w:val="000000"/>
           <w:sz w:val="24"/>
           <w:szCs w:val="24"/>
+        </w:rPr>
+      </w:pPr>
+      <w:r>
+        <w:rPr>
+          <w:rFonts w:ascii="Times New Roman" w:cs="Times New Roman" w:eastAsia="Times New Roman" w:hAnsi="Times New Roman"/>
+          <w:color w:val="000000"/>
+          <w:sz w:val="24"/>
+          <w:szCs w:val="24"/>
           <w:rtl w:val="0"/>
         </w:rPr>
         <w:t xml:space="preserve">Relaciones principales: plan_menu 1:N menu_item; receta 1:N menu_item; receta 1:N receta_ingrediente; ingrediente 1:N receta_ingrediente. La relación receta–ingrediente es de muchos a muchos y se resuelve mediante receta_ingrediente.</w:t>
       </w:r>
+    </w:p>
+    <w:p>
+      <w:pPr>
+        <w:spacing w:after="0" w:line="480" w:lineRule="auto"/>
+        <w:ind w:firstLine="720"/>
+        <w:rPr/>
+      </w:pPr>
+      <w:r>
+        <w:rPr>
+          <w:rtl w:val="0"/>
+        </w:rPr>
+      </w:r>
+    </w:p>
+    <w:p>
+      <w:pPr>
+        <w:spacing w:after="0" w:line="480" w:lineRule="auto"/>
+        <w:ind w:firstLine="720"/>
+        <w:rPr/>
+      </w:pPr>
       <w:r>
         <w:rPr>
           <w:rtl w:val="0"/>
@@ -4907,9 +4932,39 @@
         <w:rPr>
           <w:i w:val="1"/>
           <w:iCs w:val="1"/>
-          <w:rtl w:val="0"/>
-        </w:rPr>
-        <w:t xml:space="preserve">[Diagrama entidad-relación: insertar aquí la figura generada a partir del modelo anterior.]</w:t>
+        </w:rPr>
+        <w:drawing>
+          <wp:inline distB="114300" distT="114300" distL="114300" distR="114300">
+            <wp:extent cx="5943600" cy="3962400"/>
+            <wp:effectExtent b="0" l="0" r="0" t="0"/>
+            <wp:docPr id="1" name="image1.png"/>
+            <a:graphic>
+              <a:graphicData uri="http://schemas.openxmlformats.org/drawingml/2006/picture">
+                <pic:pic>
+                  <pic:nvPicPr>
+                    <pic:cNvPr id="0" name="image1.png"/>
+                    <pic:cNvPicPr preferRelativeResize="0"/>
+                  </pic:nvPicPr>
+                  <pic:blipFill>
+                    <a:blip r:embed="rId7"/>
+                    <a:srcRect b="0" l="0" r="0" t="0"/>
+                    <a:stretch>
+                      <a:fillRect/>
+                    </a:stretch>
+                  </pic:blipFill>
+                  <pic:spPr>
+                    <a:xfrm>
+                      <a:off x="0" y="0"/>
+                      <a:ext cx="5943600" cy="3962400"/>
+                    </a:xfrm>
+                    <a:prstGeom prst="rect"/>
+                    <a:ln/>
+                  </pic:spPr>
+                </pic:pic>
+              </a:graphicData>
+            </a:graphic>
+          </wp:inline>
+        </w:drawing>
       </w:r>
       <w:r>
         <w:rPr>
@@ -6749,7 +6804,7 @@
       </w:r>
     </w:p>
     <w:sectPr>
-      <w:footerReference r:id="rId6" w:type="default"/>
+      <w:footerReference r:id="rId8" w:type="default"/>
       <w:pgSz w:h="15840" w:w="12240" w:orient="portrait"/>
       <w:pgMar w:bottom="1440" w:top="1440" w:left="1440" w:right="1440" w:header="720" w:footer="720"/>
       <w:pgNumType w:start="1"/>

</xml_diff>